<commit_message>
docs(sales): EIC POA — owner name set to الأستاذ باهر بكر مقنص (Mr. Baher Bakr Magnas)
Co-Authored-By: Claude Sonnet 5.5 <noreply@anthropic.com>
Claude-Session: https://claude.ai/code/session_01LPq6YsDfSCxFZnywfga5Vg
</commit_message>
<xml_diff>
--- a/docs/sales/cases/2026-10-29-eic-workspaces-poa/EIC-POA-bilingual-three-forms-REVIEW-ONLY-not-for-client.docx
+++ b/docs/sales/cases/2026-10-29-eic-workspaces-poa/EIC-POA-bilingual-three-forms-REVIEW-ONLY-not-for-client.docx
@@ -320,7 +320,7 @@
                 <w:b w:val="0"/>
                 <w:sz w:val="20"/>
               </w:rPr>
-              <w:t>Dr. Baher Bakr Magnas, nationality: [●], holder of [ID/passport] No. [●], date of birth [●] (hereinafter the "Agent"),</w:t>
+              <w:t>Mr. Baher Bakr Magnas, nationality: [●], holder of [ID/passport] No. [●], date of birth [●] (hereinafter the "Agent"),</w:t>
             </w:r>
           </w:p>
         </w:tc>
@@ -351,7 +351,7 @@
                 <w:sz w:val="22"/>
                 <w:rtl/>
               </w:rPr>
-              <w:t>‏الدكتور/ باهر بكر مقنص، [الجنسية: ●]، يحمل [الهوية/جواز السفر] رقم [●]، وتاريخ ميلاده [●] (ويُشار إليه فيما يلي بـ «الوكيل»)،</w:t>
+              <w:t>‏الأستاذ/ باهر بكر مقنص، [الجنسية: ●]، يحمل [الهوية/جواز السفر] رقم [●]، وتاريخ ميلاده [●] (ويُشار إليه فيما يلي بـ «الوكيل»)،</w:t>
             </w:r>
           </w:p>
         </w:tc>
@@ -2386,7 +2386,7 @@
                 <w:b w:val="0"/>
                 <w:sz w:val="20"/>
               </w:rPr>
-              <w:t>Have appointed Dr. Baher Bakr Magnas, nationality: [●], holder of [ID/passport] No. [●], date of birth [●] (hereinafter the "Agent"), to act alone, without referring to the Principal, the Company's manager or its owner, in dealing with all the entities set out below and acting on behalf of the Company in all matters concerning its business and licences, as follows:</w:t>
+              <w:t>Have appointed Mr. Baher Bakr Magnas, nationality: [●], holder of [ID/passport] No. [●], date of birth [●] (hereinafter the "Agent"), to act alone, without referring to the Principal, the Company's manager or its owner, in dealing with all the entities set out below and acting on behalf of the Company in all matters concerning its business and licences, as follows:</w:t>
             </w:r>
           </w:p>
         </w:tc>
@@ -2417,7 +2417,7 @@
                 <w:sz w:val="22"/>
                 <w:rtl/>
               </w:rPr>
-              <w:t>‏وقد وكّلت الدكتور/ باهر بكر مقنص، [الجنسية: ●]، [الهوية/جواز السفر] رقم [●]، وتاريخ ميلاده [●] (الوكيل)، ليباشر منفرداً، دون الرجوع إلى الموكِّلة أو مدير الشركة أو مالكها، مراجعة جميع الجهات المبينة أدناه والتصرف نيابة عن الشركة في كل ما يتعلق بأعمالها وتراخيصها، على الوجه الآتي:</w:t>
+              <w:t>‏وقد وكّلت الأستاذ/ باهر بكر مقنص، [الجنسية: ●]، [الهوية/جواز السفر] رقم [●]، وتاريخ ميلاده [●] (الوكيل)، ليباشر منفرداً، دون الرجوع إلى الموكِّلة أو مدير الشركة أو مالكها، مراجعة جميع الجهات المبينة أدناه والتصرف نيابة عن الشركة في كل ما يتعلق بأعمالها وتراخيصها، على الوجه الآتي:</w:t>
             </w:r>
           </w:p>
         </w:tc>
@@ -4504,7 +4504,7 @@
                 <w:b w:val="0"/>
                 <w:sz w:val="20"/>
               </w:rPr>
-              <w:t>Have appointed Dr. Baher Bakr Magnas, nationality: [●], holder of [ID/passport] No. [●], date of birth [●] (hereinafter the "Agent"), as comprehensive special attorney on behalf of the Principal and the Company, acting alone without referring to the Principal, the Company's manager, its owner or any other party, and authorised to do everything for the Company in the matters set out below, as follows:</w:t>
+              <w:t>Have appointed Mr. Baher Bakr Magnas, nationality: [●], holder of [ID/passport] No. [●], date of birth [●] (hereinafter the "Agent"), as comprehensive special attorney on behalf of the Principal and the Company, acting alone without referring to the Principal, the Company's manager, its owner or any other party, and authorised to do everything for the Company in the matters set out below, as follows:</w:t>
             </w:r>
           </w:p>
         </w:tc>
@@ -4535,7 +4535,7 @@
                 <w:sz w:val="22"/>
                 <w:rtl/>
               </w:rPr>
-              <w:t>‏وقد وكّلت الدكتور/ باهر بكر مقنص، [الجنسية: ●]، [الهوية/جواز السفر] رقم [●]، وتاريخ ميلاده [●] (الوكيل)، وكالة خاصة شاملة بالنيابة عنها وعن الشركة، يباشرها منفرداً دون الرجوع إلى الموكِّلة أو إلى مدير الشركة أو مالكها أو أي جهة أخرى، ويجوز له بموجبها القيام بكل شيء للشركة في الأمور المبيّنة أدناه، وذلك على الوجه الآتي:</w:t>
+              <w:t>‏وقد وكّلت الأستاذ/ باهر بكر مقنص، [الجنسية: ●]، [الهوية/جواز السفر] رقم [●]، وتاريخ ميلاده [●] (الوكيل)، وكالة خاصة شاملة بالنيابة عنها وعن الشركة، يباشرها منفرداً دون الرجوع إلى الموكِّلة أو إلى مدير الشركة أو مالكها أو أي جهة أخرى، ويجوز له بموجبها القيام بكل شيء للشركة في الأمور المبيّنة أدناه، وذلك على الوجه الآتي:</w:t>
             </w:r>
           </w:p>
         </w:tc>

</xml_diff>

<commit_message>
docs(sales): EIC POA v3 — explicit exclusions, bank-record updates, 2-year term, Nafath/civil-status/premium-residency edits
Co-Authored-By: Claude Sonnet 5.5 <noreply@anthropic.com>
Claude-Session: https://claude.ai/code/session_01LPq6YsDfSCxFZnywfga5Vg
</commit_message>
<xml_diff>
--- a/docs/sales/cases/2026-10-29-eic-workspaces-poa/EIC-POA-bilingual-three-forms-REVIEW-ONLY-not-for-client.docx
+++ b/docs/sales/cases/2026-10-29-eic-workspaces-poa/EIC-POA-bilingual-three-forms-REVIEW-ONLY-not-for-client.docx
@@ -146,7 +146,7 @@
                 <w:b w:val="0"/>
                 <w:sz w:val="20"/>
               </w:rPr>
-              <w:t>Raya for Building Construction and Management Company (the "Parent Company"), an Egyptian company registered in the Arab Republic of Egypt under Commercial Register No. 29592, with its head office at [●], legally represented by Mr./Ms. [●] in the capacity of [●] pursuant to [●] (hereinafter the "Principal"), being the owner of the entire share capital of "EIC Workspaces", a one-person limited liability company registered in the Kingdom of Saudi Arabia under Unified National Number 7050483374 (700), meaning this specific establishment under whatever name, trade name or trademark it holds at present or after any later change (hereinafter the "Company").</w:t>
+              <w:t>Raya for Building Construction and Management Company (the "Parent Company"), an Egyptian company registered in the Arab Republic of Egypt under Commercial Register No. 29592, with its head office at [●], legally represented by Mr./Ms. [●] in the capacity of [●] pursuant to [●] (hereinafter the "Principal"), being the owner of the entire share capital of "EIC Workspaces", a one-person limited liability company registered in the Kingdom of Saudi Arabia under Unified National Number 7050483374, meaning this specific establishment under whatever name, trade name or trademark it holds at present or after any later change (hereinafter the "Company").</w:t>
             </w:r>
           </w:p>
         </w:tc>
@@ -177,7 +177,7 @@
                 <w:sz w:val="22"/>
                 <w:rtl/>
               </w:rPr>
-              <w:t>‏شركة راية لإنشاء وإدارة المباني (الشركة الأم)، شركة مسجلة في جمهورية مصر العربية بسجل تجاري رقم 29592، ومقرها [●]، ويمثلها قانوناً السيد/ [●] بصفته [●] بموجب [●] (ويُشار إليها فيما يلي بـ «الموكِّلة»)، وهي المالكة لكامل حصص شركة «إي.آي.سي ووركسبايسز»، شركة ذات مسؤولية محدودة (شخص واحد) مسجلة في المملكة العربية السعودية بالرقم الوطني الموحد 7050483374 (700)، ويُقصد بها هذه المنشأة بعينها أياً كان اسمها أو اسمها التجاري أو علامتها التجارية في الوقت الحالي أو بعد أي تغيير لاحق (ويُشار إليها فيما يلي بـ «الشركة»).</w:t>
+              <w:t>‏شركة راية لإنشاء وإدارة المباني (الشركة الأم)، شركة مسجلة في جمهورية مصر العربية بسجل تجاري رقم 29592، ومقرها [●]، ويمثلها قانوناً السيد/ [●] بصفته [●] بموجب [●] (ويُشار إليها فيما يلي بـ «الموكِّلة»)، وهي المالكة لكامل حصص شركة «إي.آي.سي ووركسبايسز»، شركة ذات مسؤولية محدودة (شخص واحد) مسجلة في المملكة العربية السعودية بالرقم الوطني الموحد 7050483374، ويُقصد بها هذه المنشأة بعينها أياً كان اسمها أو اسمها التجاري أو علامتها التجارية في الوقت الحالي أو بعد أي تغيير لاحق (ويُشار إليها فيما يلي بـ «الشركة»).</w:t>
             </w:r>
           </w:p>
         </w:tc>
@@ -1138,7 +1138,7 @@
                 <w:b w:val="0"/>
                 <w:sz w:val="20"/>
               </w:rPr>
-              <w:t>1) To issue Commercial Registers (main and branch), renew, amend and cancel them; to obtain copies and data certificates; to update their data, activities and addresses; and to pay fees.</w:t>
+              <w:t>1) To issue Commercial Registers (main and branch), renew and amend them; to obtain copies and data certificates; to update their data, activities and addresses; and to pay fees.</w:t>
             </w:r>
           </w:p>
         </w:tc>
@@ -1169,7 +1169,7 @@
                 <w:sz w:val="22"/>
                 <w:rtl/>
               </w:rPr>
-              <w:t>‏1) إصدار السجلات التجارية (الرئيسية والفرعية) وتجديدها وتعديلها وشطبها، وإصدار نسخ منها وشهادات بياناتها، وتحديث بياناتها ونشاطها وعنوانها، وسداد الرسوم.</w:t>
+              <w:t>‏1) إصدار السجلات التجارية (الرئيسية والفرعية) وتجديدها وتعديلها، وإصدار نسخ منها وشهادات بياناتها، وتحديث بياناتها ونشاطها وعنوانها، وسداد الرسوم.</w:t>
             </w:r>
           </w:p>
         </w:tc>
@@ -1548,7 +1548,7 @@
                 <w:b w:val="0"/>
                 <w:sz w:val="20"/>
               </w:rPr>
-              <w:t>• Using the Company's account at the Saudi Business Center, the Ministry of Investment and other administrative platforms, and logging in on behalf of the Company.</w:t>
+              <w:t>• Using the powers delegated to him in the Company's account at the Saudi Business Center, the Ministry of Investment and other administrative platforms, and creating and accepting electronic authorisations through each platform's official channels.</w:t>
             </w:r>
           </w:p>
         </w:tc>
@@ -1579,7 +1579,7 @@
                 <w:sz w:val="22"/>
                 <w:rtl/>
               </w:rPr>
-              <w:t>‏• استخدام حساب الشركة في المركز السعودي للأعمال ووزارة الاستثمار والمنصات الإدارية الأخرى، وتسجيل الدخول نيابة عن الشركة.</w:t>
+              <w:t>‏• استخدام الصلاحيات المفوّضة له في حساب الشركة لدى المركز السعودي للأعمال ووزارة الاستثمار والمنصات الإدارية الأخرى، وإنشاء وقبول التفويضات الإلكترونية عبر قنوات كل منصة.</w:t>
             </w:r>
           </w:p>
         </w:tc>
@@ -1782,7 +1782,7 @@
                 <w:b w:val="0"/>
                 <w:sz w:val="20"/>
               </w:rPr>
-              <w:t>3) This power of attorney expressly excludes any banking or financial act: opening bank accounts, withdrawals and deposits, signing cheques, guarantees, loans and facilities. It also expressly excludes all judicial matters: courts, lawsuits, cases, enforcement, arbitration, settlement, the Public Prosecution and anything connected with them. [Optional items not included unless expressly added: transferring or selling share ownership, liquidating the Company, increasing or reducing its capital.]</w:t>
+              <w:t>3) This power of attorney expressly excludes: (a) all judicial matters: courts, lawsuits, cases, enforcement, arbitration, settlement, the Public Prosecution and anything connected with them, and any objection or grievance brought before a judicial or quasi-judicial body, adjudication committee or the Board of Grievances (an administrative objection or grievance before the same authority is included); (b) transferring, selling or pledging share ownership, liquidating or dissolving the Company, and increasing, reducing or changing its capital; and (c) opening bank accounts, deposits, withdrawals, transfers, signing cheques, guarantees, loans and facilities, and disposing of any funds, except as provided in the following clause.</w:t>
             </w:r>
           </w:p>
         </w:tc>
@@ -1813,7 +1813,7 @@
                 <w:sz w:val="22"/>
                 <w:rtl/>
               </w:rPr>
-              <w:t>‏3) يستثنى من هذه الوكالة صراحةً أي عمل بنكي أو مصرفي: فتح الحسابات والسحب والإيداع والتوقيع على الشيكات والكفالات والقروض والتسهيلات. وتستثنى كذلك صراحةً الأمور القضائية كلها: المحاكم والدعاوى والقضايا والتنفيذ والتحكيم والصلح والنيابة العامة وما يتصل بها. [بنود اختيارية لا تدخل ما لم تُضف صراحة: نقل ملكية الحصص أو بيعها، تصفية الشركة، زيادة رأس المال أو تخفيضه.]</w:t>
+              <w:t>‏3) يستثنى من هذه الوكالة صراحةً: (أ) الأمور القضائية كلها: المحاكم والدعاوى والقضايا والتنفيذ والتحكيم والصلح والنيابة العامة وما يتصل بها، وكل اعتراض أو تظلم يُرفع إلى جهة قضائية أو شبه قضائية أو لجنة فصل أو ديوان المظالم؛ أما الاعتراض والتظلم الإداري لدى الجهة نفسها فمشمول. (ب) نقل ملكية الحصص أو بيعها أو رهنها، وتصفية الشركة أو حلها، وزيادة رأس المال أو تخفيضه أو تغييره. (ج) فتح الحسابات البنكية والإيداع والسحب والتحويل والتوقيع على الشيكات والكفالات والقروض والتسهيلات والتصرف في أي أموال، وذلك فيما عدا ما نصّ عليه البند التالي.</w:t>
             </w:r>
           </w:p>
         </w:tc>
@@ -1840,7 +1840,7 @@
                 <w:b w:val="0"/>
                 <w:sz w:val="20"/>
               </w:rPr>
-              <w:t>4) This power of attorney includes everything necessary to carry out the matters stated even if not expressly mentioned, and the Agent may act on all of it without referring to the Principal, the Company's owner or its manager. It is limited to the Company named above and entities affiliated with it or established by the Principal in the Kingdom of Saudi Arabia, and does not extend to the Principal's assets or obligations in Egypt or outside the Kingdom.</w:t>
+              <w:t>4) Banking matters: the Agent may deal with banks to update the Company's records after any change in its name, trade name, constitutive contract, commercial register, managers or authorised signatories: submitting the updated documents, completing know-your-customer forms and updating the data and the names of authorised signatories, and receiving statements and letters, without disposing of any funds or accounts. Government fees are paid either by transferring them from the Company to the Agent to pay, or directly from the Company's account by its authorised account signatories; payment through official payment channels is not an excluded banking act.</w:t>
             </w:r>
           </w:p>
         </w:tc>
@@ -1871,7 +1871,7 @@
                 <w:sz w:val="22"/>
                 <w:rtl/>
               </w:rPr>
-              <w:t>‏4) تشمل هذه الوكالة كل ما يلزم لتنفيذ الأمور المذكورة وإن لم يُنص عليه، وللوكيل أن يتصرف في ذلك كله دون الرجوع إلى الموكِّلة أو مالك الشركة أو مديرها، وتقتصر على الشركة المذكورة وما يتبعها أو تؤسسه الموكِّلة في المملكة العربية السعودية، ولا تمتد إلى أصول الموكِّلة أو التزاماتها في مصر أو خارج المملكة.</w:t>
+              <w:t>‏4) الأمور البنكية: للوكيل مراجعة البنوك لتحديث بيانات الشركة لديها بعد أي تغيير في اسمها أو اسمها التجاري أو عقد تأسيسها أو سجلها التجاري أو مديريها أو المفوضين بالتوقيع عنها: تقديم المستندات المحدّثة، وتعبئة نماذج التعريف بالعميل وتحديث البيانات وأسماء المفوضين، واستلام الإفادات والخطابات، دون التصرف في الأموال أو الحسابات. وتُسدَّد الرسوم الحكومية إما بتحويلها من الشركة إلى الوكيل ليدفعها، وإما بدفعها مباشرة من حساب الشركة بمعرفة المفوضين على الحساب، ولا يُعد السداد بقنوات الدفع الرسمية عملاً بنكياً مستثنى.</w:t>
             </w:r>
           </w:p>
         </w:tc>
@@ -1898,7 +1898,7 @@
                 <w:b w:val="0"/>
                 <w:sz w:val="20"/>
               </w:rPr>
-              <w:t>5) Notice: this power of attorney remains valid and fully effective, and does not lapse, stop or require re-issue, upon any change of the Company's name, trade name, trademark or legal form, however often it occurs, because the Company is identified by its Unified National Number 7050483374 (700), not by its name. The Agent may carry out everything stated in it under the old name, the new name, or both, and may present this power of attorney to any authority together with the updated commercial register certificate or proof that the Unified National Number has not changed.</w:t>
+              <w:t>5) This power of attorney includes everything necessary to carry out the matters stated even if not expressly mentioned, and the Agent may act on all of it without referring to the Principal, the Company's owner or its manager. It is limited to the Company named above and entities affiliated with it or established by the Principal in the Kingdom of Saudi Arabia, and does not extend to the Principal's assets or obligations in Egypt or outside the Kingdom.</w:t>
             </w:r>
           </w:p>
         </w:tc>
@@ -1929,7 +1929,7 @@
                 <w:sz w:val="22"/>
                 <w:rtl/>
               </w:rPr>
-              <w:t>‏5) تنبيه: تبقى هذه الوكالة سارية ونافذة بكامل صلاحياتها ولا تسقط ولا تتوقف ولا تحتاج إلى إعادة إصدار عند تغيير اسم الشركة أو اسمها التجاري أو علامتها التجارية أو شكلها القانوني، مهما تكرر ذلك، لأن المعتبر في تحديد الشركة هو الرقم الوطني الموحد 7050483374 (700) وليس اسمها. وللوكيل أن يباشر كل ما ورد فيها باسم الشركة القديم أو الجديد أو بهما معاً، وأن يقدّم هذه الوكالة أمام أي جهة مع شهادة السجل التجاري المحدّثة أو ما يثبت أن الرقم الوطني الموحد لم يتغير.</w:t>
+              <w:t>‏5) تشمل هذه الوكالة كل ما يلزم لتنفيذ الأمور المذكورة وإن لم يُنص عليه، وللوكيل أن يتصرف في ذلك كله دون الرجوع إلى الموكِّلة أو مالك الشركة أو مديرها، وتقتصر على الشركة المذكورة وما يتبعها أو تؤسسه الموكِّلة في المملكة العربية السعودية، ولا تمتد إلى أصول الموكِّلة أو التزاماتها في مصر أو خارج المملكة.</w:t>
             </w:r>
           </w:p>
         </w:tc>
@@ -1956,7 +1956,7 @@
                 <w:b w:val="0"/>
                 <w:sz w:val="20"/>
               </w:rPr>
-              <w:t>6) Term of the power of attorney: [●] years from the date of attestation; it remains valid until the Principal cancels it by formal, notarised notice.</w:t>
+              <w:t>6) Notice: this power of attorney remains valid and fully effective, and does not lapse, stop or require re-issue, upon any change of the Company's name, trade name, trademark or legal form, however often it occurs, because the Company is identified by its Unified National Number 7050483374, not by its name; for identification only, the Company's current name is EIC Workspaces and its current commercial register number is [●]. The Agent may carry out everything stated in it under the old name, the new name, or both, and may present this power of attorney to any authority together with the updated commercial register certificate or proof that the Unified National Number has not changed.</w:t>
             </w:r>
           </w:p>
         </w:tc>
@@ -1987,7 +1987,7 @@
                 <w:sz w:val="22"/>
                 <w:rtl/>
               </w:rPr>
-              <w:t>‏6) مدة الوكالة: [●] سنة من تاريخ التصديق، وتبقى سارية حتى يُلغيها الموكِّل بإشعار رسمي موثّق.</w:t>
+              <w:t>‏6) تنبيه: تبقى هذه الوكالة سارية ونافذة بكامل صلاحياتها ولا تسقط ولا تتوقف ولا تحتاج إلى إعادة إصدار عند تغيير اسم الشركة أو اسمها التجاري أو علامتها التجارية أو شكلها القانوني، مهما تكرر ذلك، لأن المعتبر في تحديد الشركة هو الرقم الوطني الموحد 7050483374 وليس اسمها، ويُذكر هنا للتعريف: اسم الشركة الحالي «إي.آي.سي ووركسبايسز» ورقم سجلها التجاري الحالي [●]. وللوكيل أن يباشر كل ما ورد فيها باسم الشركة القديم أو الجديد أو بهما معاً، وأن يقدّم هذه الوكالة أمام أي جهة مع شهادة السجل التجاري المحدّثة أو ما يثبت أن الرقم الوطني الموحد لم يتغير.</w:t>
             </w:r>
           </w:p>
         </w:tc>
@@ -2014,7 +2014,7 @@
                 <w:b w:val="0"/>
                 <w:sz w:val="20"/>
               </w:rPr>
-              <w:t>7) This power of attorney is drawn up in Arabic and English; in case of discrepancy the Arabic text prevails.</w:t>
+              <w:t>7) Term of the power of attorney: two (2) years from the date of attestation, unless the Principal cancels it earlier by formal, notarised notice.</w:t>
             </w:r>
           </w:p>
         </w:tc>
@@ -2045,7 +2045,65 @@
                 <w:sz w:val="22"/>
                 <w:rtl/>
               </w:rPr>
-              <w:t>‏7) حُرّرت هذه الوكالة بلغتين، العربية والإنجليزية، وعند الاختلاف يُعتدّ بالنص العربي.</w:t>
+              <w:t>‏7) مدة الوكالة: سنتان (2) من تاريخ التصديق، ما لم يُلغها الموكِّل قبل ذلك بإشعار رسمي موثّق.</w:t>
+            </w:r>
+          </w:p>
+        </w:tc>
+      </w:tr>
+      <w:tr>
+        <w:tc>
+          <w:tcPr>
+            <w:tcW w:type="dxa" w:w="4932"/>
+            <w:tcBorders>
+              <w:top w:val="nil"/>
+              <w:left w:val="nil"/>
+              <w:right w:val="nil"/>
+              <w:bottom w:val="single" w:sz="4" w:color="C9D1DA"/>
+            </w:tcBorders>
+          </w:tcPr>
+          <w:p>
+            <w:pPr>
+              <w:spacing w:after="60" w:line="276" w:lineRule="auto"/>
+              <w:jc w:val="left"/>
+            </w:pPr>
+            <w:r/>
+            <w:r>
+              <w:rPr>
+                <w:b w:val="0"/>
+                <w:sz w:val="20"/>
+              </w:rPr>
+              <w:t>8) This power of attorney is drawn up in Arabic and English; in case of discrepancy the Arabic text prevails.</w:t>
+            </w:r>
+          </w:p>
+        </w:tc>
+        <w:tc>
+          <w:tcPr>
+            <w:tcW w:type="dxa" w:w="4932"/>
+            <w:tcBorders>
+              <w:top w:val="nil"/>
+              <w:left w:val="nil"/>
+              <w:right w:val="nil"/>
+              <w:bottom w:val="single" w:sz="4" w:color="C9D1DA"/>
+            </w:tcBorders>
+          </w:tcPr>
+          <w:p>
+            <w:pPr>
+              <w:bidi/>
+              <w:spacing w:after="60" w:line="276" w:lineRule="auto"/>
+              <w:jc w:val="right"/>
+            </w:pPr>
+            <w:r>
+              <w:rPr>
+                <w:rtl/>
+              </w:rPr>
+            </w:r>
+            <w:r>
+              <w:rPr>
+                <w:b w:val="0"/>
+                <w:sz w:val="22"/>
+                <w:rtl/>
+              </w:rPr>
+              <w:t>‏8) حُرّرت هذه الوكالة بلغتين، العربية والإنجليزية، وعند الاختلاف يُعتدّ بالنص العربي.</w:t>
             </w:r>
           </w:p>
         </w:tc>
@@ -2270,7 +2328,7 @@
                 <w:b w:val="0"/>
                 <w:sz w:val="20"/>
               </w:rPr>
-              <w:t>On [●] corresponding to [●], I, the undersigned: Raya for Building Construction and Management Company (the "Parent Company"), an Egyptian company registered in the Arab Republic of Egypt under Commercial Register No. 29592, with its head office at [●], legally represented by Mr./Ms. [●] in the capacity of [●] pursuant to [●] (hereinafter the "Principal"), being the owner of the entire share capital of "EIC Workspaces", a one-person limited liability company registered in the Kingdom of Saudi Arabia under Unified National Number 7050483374 (700), meaning this specific establishment under whatever name, trade name or trademark it holds at present or after any later change (hereinafter the "Company").</w:t>
+              <w:t>On [●] corresponding to [●], I, the undersigned: Raya for Building Construction and Management Company (the "Parent Company"), an Egyptian company registered in the Arab Republic of Egypt under Commercial Register No. 29592, with its head office at [●], legally represented by Mr./Ms. [●] in the capacity of [●] pursuant to [●] (hereinafter the "Principal"), being the owner of the entire share capital of "EIC Workspaces", a one-person limited liability company registered in the Kingdom of Saudi Arabia under Unified National Number 7050483374, meaning this specific establishment under whatever name, trade name or trademark it holds at present or after any later change (hereinafter the "Company").</w:t>
             </w:r>
           </w:p>
         </w:tc>
@@ -2301,7 +2359,7 @@
                 <w:sz w:val="22"/>
                 <w:rtl/>
               </w:rPr>
-              <w:t>‏إنه في يوم [●] الموافق [●]، أنا الموقّع أدناه: شركة راية لإنشاء وإدارة المباني (الموكِّلة)، شركة مسجلة في جمهورية مصر العربية بسجل تجاري رقم 29592، وهي المالكة لكامل حصص شركة «إي.آي.سي ووركسبايسز» (الشركة)، بالرقم الوطني الموحد 7050483374 (700)، ويُقصد بها هذه المنشأة بعينها أياً كان اسمها أو اسمها التجاري أو علامتها التجارية الحالية أو اللاحقة، ويمثلها قانوناً السيد/ [●] بصفته [●].</w:t>
+              <w:t>‏إنه في يوم [●] الموافق [●]، أنا الموقّع أدناه: شركة راية لإنشاء وإدارة المباني (الموكِّلة)، شركة مسجلة في جمهورية مصر العربية بسجل تجاري رقم 29592، وهي المالكة لكامل حصص شركة «إي.آي.سي ووركسبايسز» (الشركة)، بالرقم الوطني الموحد 7050483374، ويُقصد بها هذه المنشأة بعينها أياً كان اسمها أو اسمها التجاري أو علامتها التجارية الحالية أو اللاحقة، ويمثلها قانوناً السيد/ [●] بصفته [●].</w:t>
             </w:r>
           </w:p>
         </w:tc>
@@ -2620,7 +2678,7 @@
                 <w:b w:val="0"/>
                 <w:sz w:val="20"/>
               </w:rPr>
-              <w:t>3) Ministry of Interior and General Directorate of Passports: Muqeem and Absher Business: residence permits and their renewal, transfer of sponsorship, exit and re-entry, visas, booking appointments and registering authorised persons.</w:t>
+              <w:t>3) Ministry of Interior and General Directorate of Passports: Muqeem and Absher Business: residence permits and their renewal, transfer of sponsorship, exit and re-entry, visas, booking appointments and registering authorised persons, and applying for Premium Residency for the Company's manager, employees and their families, following up the application and issuing and renewing the residence.</w:t>
             </w:r>
           </w:p>
         </w:tc>
@@ -2651,7 +2709,7 @@
                 <w:sz w:val="22"/>
                 <w:rtl/>
               </w:rPr>
-              <w:t>‏3) وزارة الداخلية والمديرية العامة للجوازات: مقيم وأبشر أعمال: الإقامات وتجديدها ونقل الكفالة والخروج والعودة والتأشيرات، وحجز المواعيد، وتسجيل المفوضين.</w:t>
+              <w:t>‏3) وزارة الداخلية والمديرية العامة للجوازات: مقيم وأبشر أعمال: الإقامات وتجديدها ونقل الكفالة والخروج والعودة والتأشيرات، وحجز المواعيد، وتسجيل المفوضين، والتقديم على الإقامة المميزة لمدير الشركة وموظفيها وأسرهم ومتابعة الطلب وإصدار الإقامة وتجديدها.</w:t>
             </w:r>
           </w:p>
         </w:tc>
@@ -3200,7 +3258,7 @@
                 <w:b w:val="0"/>
                 <w:sz w:val="20"/>
               </w:rPr>
-              <w:t>13) Civil Status: dealing with the Civil Status Agency concerning the Company, its employees and authorised persons: issuing identity and family data and statements; updating data; receiving documents; correcting errors; and completing related transactions.</w:t>
+              <w:t>13) Civil Status: dealing with the Civil Status Agency concerning the Company, its employees, authorised persons and manager: issuing and updating data and statements; receiving documents; correcting errors; recruiting the families of employees and of the Company's manager (spouse and children) and issuing and renewing their visas and residence permits; and completing related transactions.</w:t>
             </w:r>
           </w:p>
         </w:tc>
@@ -3231,7 +3289,7 @@
                 <w:sz w:val="22"/>
                 <w:rtl/>
               </w:rPr>
-              <w:t>‏13) الأحوال المدنية: مراجعة الأحوال المدنية فيما يخص الشركة وموظفيها ومفوضيها: إصدار بيانات الهوية والأسرة والإفادات، وتحديث البيانات، واستلام المستندات، وتصحيح الأخطاء، وإنهاء المعاملات المتعلقة بها.</w:t>
+              <w:t>‏13) الأحوال المدنية: مراجعة الأحوال المدنية فيما يخص الشركة وموظفيها ومفوضيها ومديرها: إصدار البيانات والإفادات وتحديثها، واستلام المستندات، وتصحيح الأخطاء، واستقدام أسر الموظفين ومدير الشركة (الزوجة والأبناء) وإصدار تأشيراتهم وإقاماتهم وتجديدها، وإنهاء المعاملات المتعلقة بها.</w:t>
             </w:r>
           </w:p>
         </w:tc>
@@ -3492,7 +3550,7 @@
                 <w:b w:val="0"/>
                 <w:sz w:val="20"/>
               </w:rPr>
-              <w:t>• National Single Sign-On (Nafath) or the entity responsible for it: registering the Company and the Agent, authorising access, issuing authentication and verification means, and requesting reset, recovery and updates.</w:t>
+              <w:t>• National Single Sign-On (Nafath) or the entity responsible for it: registering the Company and the Agent, creating and accepting electronic authorisations through the platform's official channels, and requesting reset, recovery and updates.</w:t>
             </w:r>
           </w:p>
         </w:tc>
@@ -3523,7 +3581,7 @@
                 <w:sz w:val="22"/>
                 <w:rtl/>
               </w:rPr>
-              <w:t>‏• النفاذ الوطني الموحد أو الجهة المسؤولة عنه: تسجيل الشركة والوكيل، وتفويض الدخول، وإصدار وسائل التوثيق والتحقق، وطلب إعادة الضبط والاسترجاع والتحديث.</w:t>
+              <w:t>‏• النفاذ الوطني الموحد أو الجهة المسؤولة عنه: تسجيل الشركة والوكيل، وإنشاء وقبول التفويضات الإلكترونية عبر قنوات المنصة، وطلب إعادة الضبط والاسترجاع والتحديث.</w:t>
             </w:r>
           </w:p>
         </w:tc>
@@ -3900,7 +3958,7 @@
                 <w:b w:val="0"/>
                 <w:sz w:val="20"/>
               </w:rPr>
-              <w:t>3) This power of attorney expressly excludes any banking or financial act: opening bank accounts, withdrawals and deposits, signing cheques, guarantees, loans and facilities. It also expressly excludes all judicial matters: courts, lawsuits, cases, enforcement, arbitration, settlement, the Public Prosecution and anything connected with them. [Optional items not included unless expressly added: transferring or selling share ownership, liquidating the Company, increasing or reducing its capital.]</w:t>
+              <w:t>3) This power of attorney expressly excludes: (a) all judicial matters: courts, lawsuits, cases, enforcement, arbitration, settlement, the Public Prosecution and anything connected with them, and any objection or grievance brought before a judicial or quasi-judicial body, adjudication committee or the Board of Grievances (an administrative objection or grievance before the same authority is included); (b) transferring, selling or pledging share ownership, liquidating or dissolving the Company, and increasing, reducing or changing its capital; and (c) opening bank accounts, deposits, withdrawals, transfers, signing cheques, guarantees, loans and facilities, and disposing of any funds, except as provided in the following clause.</w:t>
             </w:r>
           </w:p>
         </w:tc>
@@ -3931,7 +3989,7 @@
                 <w:sz w:val="22"/>
                 <w:rtl/>
               </w:rPr>
-              <w:t>‏3) يستثنى من هذه الوكالة صراحةً أي عمل بنكي أو مصرفي: فتح الحسابات والسحب والإيداع والتوقيع على الشيكات والكفالات والقروض والتسهيلات. وتستثنى كذلك صراحةً الأمور القضائية كلها: المحاكم والدعاوى والقضايا والتنفيذ والتحكيم والصلح والنيابة العامة وما يتصل بها. [بنود اختيارية لا تدخل ما لم تُضف صراحة: نقل ملكية الحصص أو بيعها، تصفية الشركة، زيادة رأس المال أو تخفيضه.]</w:t>
+              <w:t>‏3) يستثنى من هذه الوكالة صراحةً: (أ) الأمور القضائية كلها: المحاكم والدعاوى والقضايا والتنفيذ والتحكيم والصلح والنيابة العامة وما يتصل بها، وكل اعتراض أو تظلم يُرفع إلى جهة قضائية أو شبه قضائية أو لجنة فصل أو ديوان المظالم؛ أما الاعتراض والتظلم الإداري لدى الجهة نفسها فمشمول. (ب) نقل ملكية الحصص أو بيعها أو رهنها، وتصفية الشركة أو حلها، وزيادة رأس المال أو تخفيضه أو تغييره. (ج) فتح الحسابات البنكية والإيداع والسحب والتحويل والتوقيع على الشيكات والكفالات والقروض والتسهيلات والتصرف في أي أموال، وذلك فيما عدا ما نصّ عليه البند التالي.</w:t>
             </w:r>
           </w:p>
         </w:tc>
@@ -3958,7 +4016,7 @@
                 <w:b w:val="0"/>
                 <w:sz w:val="20"/>
               </w:rPr>
-              <w:t>4) This power of attorney includes everything necessary to carry out the matters stated even if not expressly mentioned, and the Agent may act on all of it without referring to the Principal, the Company's owner or its manager. It is limited to the Company named above and entities affiliated with it or established by the Principal in the Kingdom of Saudi Arabia, and does not extend to the Principal's assets or obligations in Egypt or outside the Kingdom.</w:t>
+              <w:t>4) Banking matters: the Agent may deal with banks to update the Company's records after any change in its name, trade name, constitutive contract, commercial register, managers or authorised signatories: submitting the updated documents, completing know-your-customer forms and updating the data and the names of authorised signatories, and receiving statements and letters, without disposing of any funds or accounts. Government fees are paid either by transferring them from the Company to the Agent to pay, or directly from the Company's account by its authorised account signatories; payment through official payment channels is not an excluded banking act.</w:t>
             </w:r>
           </w:p>
         </w:tc>
@@ -3989,7 +4047,7 @@
                 <w:sz w:val="22"/>
                 <w:rtl/>
               </w:rPr>
-              <w:t>‏4) تشمل هذه الوكالة كل ما يلزم لتنفيذ الأمور المذكورة وإن لم يُنص عليه، وللوكيل أن يتصرف في ذلك كله دون الرجوع إلى الموكِّلة أو مالك الشركة أو مديرها، وتقتصر على الشركة المذكورة وما يتبعها أو تؤسسه الموكِّلة في المملكة العربية السعودية، ولا تمتد إلى أصول الموكِّلة أو التزاماتها في مصر أو خارج المملكة.</w:t>
+              <w:t>‏4) الأمور البنكية: للوكيل مراجعة البنوك لتحديث بيانات الشركة لديها بعد أي تغيير في اسمها أو اسمها التجاري أو عقد تأسيسها أو سجلها التجاري أو مديريها أو المفوضين بالتوقيع عنها: تقديم المستندات المحدّثة، وتعبئة نماذج التعريف بالعميل وتحديث البيانات وأسماء المفوضين، واستلام الإفادات والخطابات، دون التصرف في الأموال أو الحسابات. وتُسدَّد الرسوم الحكومية إما بتحويلها من الشركة إلى الوكيل ليدفعها، وإما بدفعها مباشرة من حساب الشركة بمعرفة المفوضين على الحساب، ولا يُعد السداد بقنوات الدفع الرسمية عملاً بنكياً مستثنى.</w:t>
             </w:r>
           </w:p>
         </w:tc>
@@ -4016,7 +4074,7 @@
                 <w:b w:val="0"/>
                 <w:sz w:val="20"/>
               </w:rPr>
-              <w:t>5) Notice: this power of attorney remains valid and fully effective, and does not lapse, stop or require re-issue, upon any change of the Company's name, trade name, trademark or legal form, however often it occurs, because the Company is identified by its Unified National Number 7050483374 (700), not by its name. The Agent may carry out everything stated in it under the old name, the new name, or both, and may present this power of attorney to any authority together with the updated commercial register certificate or proof that the Unified National Number has not changed.</w:t>
+              <w:t>5) This power of attorney includes everything necessary to carry out the matters stated even if not expressly mentioned, and the Agent may act on all of it without referring to the Principal, the Company's owner or its manager. It is limited to the Company named above and entities affiliated with it or established by the Principal in the Kingdom of Saudi Arabia, and does not extend to the Principal's assets or obligations in Egypt or outside the Kingdom.</w:t>
             </w:r>
           </w:p>
         </w:tc>
@@ -4047,7 +4105,7 @@
                 <w:sz w:val="22"/>
                 <w:rtl/>
               </w:rPr>
-              <w:t>‏5) تنبيه: تبقى هذه الوكالة سارية ونافذة بكامل صلاحياتها ولا تسقط ولا تتوقف ولا تحتاج إلى إعادة إصدار عند تغيير اسم الشركة أو اسمها التجاري أو علامتها التجارية أو شكلها القانوني، مهما تكرر ذلك، لأن المعتبر في تحديد الشركة هو الرقم الوطني الموحد 7050483374 (700) وليس اسمها. وللوكيل أن يباشر كل ما ورد فيها باسم الشركة القديم أو الجديد أو بهما معاً، وأن يقدّم هذه الوكالة أمام أي جهة مع شهادة السجل التجاري المحدّثة أو ما يثبت أن الرقم الوطني الموحد لم يتغير.</w:t>
+              <w:t>‏5) تشمل هذه الوكالة كل ما يلزم لتنفيذ الأمور المذكورة وإن لم يُنص عليه، وللوكيل أن يتصرف في ذلك كله دون الرجوع إلى الموكِّلة أو مالك الشركة أو مديرها، وتقتصر على الشركة المذكورة وما يتبعها أو تؤسسه الموكِّلة في المملكة العربية السعودية، ولا تمتد إلى أصول الموكِّلة أو التزاماتها في مصر أو خارج المملكة.</w:t>
             </w:r>
           </w:p>
         </w:tc>
@@ -4074,7 +4132,7 @@
                 <w:b w:val="0"/>
                 <w:sz w:val="20"/>
               </w:rPr>
-              <w:t>6) Term of the power of attorney: [●] years from the date of attestation; it remains valid until the Principal cancels it by formal, notarised notice.</w:t>
+              <w:t>6) Notice: this power of attorney remains valid and fully effective, and does not lapse, stop or require re-issue, upon any change of the Company's name, trade name, trademark or legal form, however often it occurs, because the Company is identified by its Unified National Number 7050483374, not by its name; for identification only, the Company's current name is EIC Workspaces and its current commercial register number is [●]. The Agent may carry out everything stated in it under the old name, the new name, or both, and may present this power of attorney to any authority together with the updated commercial register certificate or proof that the Unified National Number has not changed.</w:t>
             </w:r>
           </w:p>
         </w:tc>
@@ -4105,7 +4163,7 @@
                 <w:sz w:val="22"/>
                 <w:rtl/>
               </w:rPr>
-              <w:t>‏6) مدة الوكالة: [●] سنة من تاريخ التصديق، وتبقى سارية حتى يُلغيها الموكِّل بإشعار رسمي موثّق.</w:t>
+              <w:t>‏6) تنبيه: تبقى هذه الوكالة سارية ونافذة بكامل صلاحياتها ولا تسقط ولا تتوقف ولا تحتاج إلى إعادة إصدار عند تغيير اسم الشركة أو اسمها التجاري أو علامتها التجارية أو شكلها القانوني، مهما تكرر ذلك، لأن المعتبر في تحديد الشركة هو الرقم الوطني الموحد 7050483374 وليس اسمها، ويُذكر هنا للتعريف: اسم الشركة الحالي «إي.آي.سي ووركسبايسز» ورقم سجلها التجاري الحالي [●]. وللوكيل أن يباشر كل ما ورد فيها باسم الشركة القديم أو الجديد أو بهما معاً، وأن يقدّم هذه الوكالة أمام أي جهة مع شهادة السجل التجاري المحدّثة أو ما يثبت أن الرقم الوطني الموحد لم يتغير.</w:t>
             </w:r>
           </w:p>
         </w:tc>
@@ -4132,7 +4190,7 @@
                 <w:b w:val="0"/>
                 <w:sz w:val="20"/>
               </w:rPr>
-              <w:t>7) This power of attorney is drawn up in Arabic and English; in case of discrepancy the Arabic text prevails.</w:t>
+              <w:t>7) Term of the power of attorney: two (2) years from the date of attestation, unless the Principal cancels it earlier by formal, notarised notice.</w:t>
             </w:r>
           </w:p>
         </w:tc>
@@ -4163,7 +4221,65 @@
                 <w:sz w:val="22"/>
                 <w:rtl/>
               </w:rPr>
-              <w:t>‏7) حُرّرت هذه الوكالة بلغتين، العربية والإنجليزية، وعند الاختلاف يُعتدّ بالنص العربي.</w:t>
+              <w:t>‏7) مدة الوكالة: سنتان (2) من تاريخ التصديق، ما لم يُلغها الموكِّل قبل ذلك بإشعار رسمي موثّق.</w:t>
+            </w:r>
+          </w:p>
+        </w:tc>
+      </w:tr>
+      <w:tr>
+        <w:tc>
+          <w:tcPr>
+            <w:tcW w:type="dxa" w:w="4932"/>
+            <w:tcBorders>
+              <w:top w:val="nil"/>
+              <w:left w:val="nil"/>
+              <w:right w:val="nil"/>
+              <w:bottom w:val="single" w:sz="4" w:color="C9D1DA"/>
+            </w:tcBorders>
+          </w:tcPr>
+          <w:p>
+            <w:pPr>
+              <w:spacing w:after="60" w:line="276" w:lineRule="auto"/>
+              <w:jc w:val="left"/>
+            </w:pPr>
+            <w:r/>
+            <w:r>
+              <w:rPr>
+                <w:b w:val="0"/>
+                <w:sz w:val="20"/>
+              </w:rPr>
+              <w:t>8) This power of attorney is drawn up in Arabic and English; in case of discrepancy the Arabic text prevails.</w:t>
+            </w:r>
+          </w:p>
+        </w:tc>
+        <w:tc>
+          <w:tcPr>
+            <w:tcW w:type="dxa" w:w="4932"/>
+            <w:tcBorders>
+              <w:top w:val="nil"/>
+              <w:left w:val="nil"/>
+              <w:right w:val="nil"/>
+              <w:bottom w:val="single" w:sz="4" w:color="C9D1DA"/>
+            </w:tcBorders>
+          </w:tcPr>
+          <w:p>
+            <w:pPr>
+              <w:bidi/>
+              <w:spacing w:after="60" w:line="276" w:lineRule="auto"/>
+              <w:jc w:val="right"/>
+            </w:pPr>
+            <w:r>
+              <w:rPr>
+                <w:rtl/>
+              </w:rPr>
+            </w:r>
+            <w:r>
+              <w:rPr>
+                <w:b w:val="0"/>
+                <w:sz w:val="22"/>
+                <w:rtl/>
+              </w:rPr>
+              <w:t>‏8) حُرّرت هذه الوكالة بلغتين، العربية والإنجليزية، وعند الاختلاف يُعتدّ بالنص العربي.</w:t>
             </w:r>
           </w:p>
         </w:tc>
@@ -4339,7 +4455,7 @@
           <w:sz w:val="25"/>
           <w:rtl/>
         </w:rPr>
-        <w:t>وكالة خاصة شاملة، بدون الصلاحيات البنكية وبدون الأمور القضائية</w:t>
+        <w:t>وكالة خاصة شاملة، دون التصرف في الحسابات البنكية ودون الأمور القضائية</w:t>
       </w:r>
     </w:p>
     <w:p>
@@ -4352,7 +4468,7 @@
           <w:b/>
           <w:sz w:val="22"/>
         </w:rPr>
-        <w:t>Comprehensive Special Power of Attorney, excluding banking powers and judicial matters</w:t>
+        <w:t>Comprehensive Special Power of Attorney, excluding dealing with bank accounts and judicial matters</w:t>
       </w:r>
     </w:p>
     <w:tbl>
@@ -4388,7 +4504,7 @@
                 <w:b w:val="0"/>
                 <w:sz w:val="20"/>
               </w:rPr>
-              <w:t>On [●] corresponding to [●], I, the undersigned: Raya for Building Construction and Management Company (the "Parent Company"), an Egyptian company registered in the Arab Republic of Egypt under Commercial Register No. 29592, with its head office at [●], legally represented by Mr./Ms. [●] in the capacity of [●] pursuant to [●] (hereinafter the "Principal"), being the owner of the entire share capital of "EIC Workspaces", a one-person limited liability company registered in the Kingdom of Saudi Arabia under Unified National Number 7050483374 (700), meaning this specific establishment under whatever name, trade name or trademark it holds at present or after any later change (hereinafter the "Company").</w:t>
+              <w:t>On [●] corresponding to [●], I, the undersigned: Raya for Building Construction and Management Company (the "Parent Company"), an Egyptian company registered in the Arab Republic of Egypt under Commercial Register No. 29592, with its head office at [●], legally represented by Mr./Ms. [●] in the capacity of [●] pursuant to [●] (hereinafter the "Principal"), being the owner of the entire share capital of "EIC Workspaces", a one-person limited liability company registered in the Kingdom of Saudi Arabia under Unified National Number 7050483374, meaning this specific establishment under whatever name, trade name or trademark it holds at present or after any later change (hereinafter the "Company").</w:t>
             </w:r>
           </w:p>
         </w:tc>
@@ -4419,7 +4535,7 @@
                 <w:sz w:val="22"/>
                 <w:rtl/>
               </w:rPr>
-              <w:t>‏إنه في يوم [●] الموافق [●]، أنا الموقّع أدناه: شركة راية لإنشاء وإدارة المباني (الشركة الأم)، شركة مسجلة في جمهورية مصر العربية بسجل تجاري رقم 29592، ومقرها [●]، ويمثلها قانوناً السيد/ [●] بصفته [●] بموجب [●] (الموكِّلة)، وهي المالكة لكامل حصص شركة «إي.آي.سي ووركسبايسز»، شركة ذات مسؤولية محدودة (شخص واحد) مسجلة في المملكة العربية السعودية بالرقم الوطني الموحد 7050483374 (700)، ويُقصد بها هذه المنشأة بعينها أياً كان اسمها أو اسمها التجاري أو علامتها التجارية في الوقت الحالي أو بعد أي تغيير لاحق (الشركة).</w:t>
+              <w:t>‏إنه في يوم [●] الموافق [●]، أنا الموقّع أدناه: شركة راية لإنشاء وإدارة المباني (الشركة الأم)، شركة مسجلة في جمهورية مصر العربية بسجل تجاري رقم 29592، ومقرها [●]، ويمثلها قانوناً السيد/ [●] بصفته [●] بموجب [●] (الموكِّلة)، وهي المالكة لكامل حصص شركة «إي.آي.سي ووركسبايسز»، شركة ذات مسؤولية محدودة (شخص واحد) مسجلة في المملكة العربية السعودية بالرقم الوطني الموحد 7050483374، ويُقصد بها هذه المنشأة بعينها أياً كان اسمها أو اسمها التجاري أو علامتها التجارية في الوقت الحالي أو بعد أي تغيير لاحق (الشركة).</w:t>
             </w:r>
           </w:p>
         </w:tc>
@@ -5264,7 +5380,7 @@
                 <w:b w:val="0"/>
                 <w:sz w:val="20"/>
               </w:rPr>
-              <w:t>1) To issue Commercial Registers (main and branch), renew, amend and cancel them; to obtain copies and data certificates; to update their data, activities and addresses; and to pay fees.</w:t>
+              <w:t>1) To issue Commercial Registers (main and branch), renew and amend them; to obtain copies and data certificates; to update their data, activities and addresses; and to pay fees.</w:t>
             </w:r>
           </w:p>
         </w:tc>
@@ -5295,7 +5411,7 @@
                 <w:sz w:val="22"/>
                 <w:rtl/>
               </w:rPr>
-              <w:t>‏1) إصدار السجلات التجارية (الرئيسية والفرعية) وتجديدها وتعديلها وشطبها، وإصدار نسخ منها وشهادات بياناتها، وتحديث بياناتها ونشاطها وعنوانها، وسداد الرسوم.</w:t>
+              <w:t>‏1) إصدار السجلات التجارية (الرئيسية والفرعية) وتجديدها وتعديلها، وإصدار نسخ منها وشهادات بياناتها، وتحديث بياناتها ونشاطها وعنوانها، وسداد الرسوم.</w:t>
             </w:r>
           </w:p>
         </w:tc>
@@ -5790,7 +5906,7 @@
                 <w:b w:val="0"/>
                 <w:sz w:val="20"/>
               </w:rPr>
-              <w:t>3) Ministry of Interior and General Directorate of Passports: Muqeem and Absher Business: residence permits and their renewal, transfer of sponsorship, exit and re-entry, visas, booking appointments and registering authorised persons.</w:t>
+              <w:t>3) Ministry of Interior and General Directorate of Passports: Muqeem and Absher Business: residence permits and their renewal, transfer of sponsorship, exit and re-entry, visas, booking appointments and registering authorised persons, and applying for Premium Residency for the Company's manager, employees and their families, following up the application and issuing and renewing the residence.</w:t>
             </w:r>
           </w:p>
         </w:tc>
@@ -5821,7 +5937,7 @@
                 <w:sz w:val="22"/>
                 <w:rtl/>
               </w:rPr>
-              <w:t>‏3) وزارة الداخلية والمديرية العامة للجوازات: مقيم وأبشر أعمال: الإقامات وتجديدها ونقل الكفالة والخروج والعودة والتأشيرات، وحجز المواعيد، وتسجيل المفوضين.</w:t>
+              <w:t>‏3) وزارة الداخلية والمديرية العامة للجوازات: مقيم وأبشر أعمال: الإقامات وتجديدها ونقل الكفالة والخروج والعودة والتأشيرات، وحجز المواعيد، وتسجيل المفوضين، والتقديم على الإقامة المميزة لمدير الشركة وموظفيها وأسرهم ومتابعة الطلب وإصدار الإقامة وتجديدها.</w:t>
             </w:r>
           </w:p>
         </w:tc>
@@ -6370,7 +6486,7 @@
                 <w:b w:val="0"/>
                 <w:sz w:val="20"/>
               </w:rPr>
-              <w:t>13) Civil Status: dealing with the Civil Status Agency concerning the Company, its employees and authorised persons: issuing identity and family data and statements; updating data; receiving documents; correcting errors; and completing related transactions.</w:t>
+              <w:t>13) Civil Status: dealing with the Civil Status Agency concerning the Company, its employees, authorised persons and manager: issuing and updating data and statements; receiving documents; correcting errors; recruiting the families of employees and of the Company's manager (spouse and children) and issuing and renewing their visas and residence permits; and completing related transactions.</w:t>
             </w:r>
           </w:p>
         </w:tc>
@@ -6401,7 +6517,7 @@
                 <w:sz w:val="22"/>
                 <w:rtl/>
               </w:rPr>
-              <w:t>‏13) الأحوال المدنية: مراجعة الأحوال المدنية فيما يخص الشركة وموظفيها ومفوضيها: إصدار بيانات الهوية والأسرة والإفادات، وتحديث البيانات، واستلام المستندات، وتصحيح الأخطاء، وإنهاء المعاملات المتعلقة بها.</w:t>
+              <w:t>‏13) الأحوال المدنية: مراجعة الأحوال المدنية فيما يخص الشركة وموظفيها ومفوضيها ومديرها: إصدار البيانات والإفادات وتحديثها، واستلام المستندات، وتصحيح الأخطاء، واستقدام أسر الموظفين ومدير الشركة (الزوجة والأبناء) وإصدار تأشيراتهم وإقاماتهم وتجديدها، وإنهاء المعاملات المتعلقة بها.</w:t>
             </w:r>
           </w:p>
         </w:tc>
@@ -6662,7 +6778,7 @@
                 <w:b w:val="0"/>
                 <w:sz w:val="20"/>
               </w:rPr>
-              <w:t>• National Single Sign-On (Nafath) or the entity responsible for it: registering the Company and the Agent, authorising access, issuing authentication and verification means, and requesting reset, recovery and updates.</w:t>
+              <w:t>• National Single Sign-On (Nafath) or the entity responsible for it: registering the Company and the Agent, creating and accepting electronic authorisations through the platform's official channels, and requesting reset, recovery and updates.</w:t>
             </w:r>
           </w:p>
         </w:tc>
@@ -6693,7 +6809,7 @@
                 <w:sz w:val="22"/>
                 <w:rtl/>
               </w:rPr>
-              <w:t>‏• النفاذ الوطني الموحد أو الجهة المسؤولة عنه: تسجيل الشركة والوكيل، وتفويض الدخول، وإصدار وسائل التوثيق والتحقق، وطلب إعادة الضبط والاسترجاع والتحديث.</w:t>
+              <w:t>‏• النفاذ الوطني الموحد أو الجهة المسؤولة عنه: تسجيل الشركة والوكيل، وإنشاء وقبول التفويضات الإلكترونية عبر قنوات المنصة، وطلب إعادة الضبط والاسترجاع والتحديث.</w:t>
             </w:r>
           </w:p>
         </w:tc>
@@ -6894,7 +7010,7 @@
                 <w:b w:val="0"/>
                 <w:sz w:val="20"/>
               </w:rPr>
-              <w:t>• Using the Company's account at the Saudi Business Center, the Ministry of Investment and other administrative platforms, and logging in on behalf of the Company.</w:t>
+              <w:t>• Using the powers delegated to him in the Company's account at the Saudi Business Center, the Ministry of Investment and other administrative platforms, and creating and accepting electronic authorisations through each platform's official channels.</w:t>
             </w:r>
           </w:p>
         </w:tc>
@@ -6925,7 +7041,7 @@
                 <w:sz w:val="22"/>
                 <w:rtl/>
               </w:rPr>
-              <w:t>‏• استخدام حساب الشركة في المركز السعودي للأعمال ووزارة الاستثمار والمنصات الإدارية الأخرى، وتسجيل الدخول نيابة عن الشركة.</w:t>
+              <w:t>‏• استخدام الصلاحيات المفوّضة له في حساب الشركة لدى المركز السعودي للأعمال ووزارة الاستثمار والمنصات الإدارية الأخرى، وإنشاء وقبول التفويضات الإلكترونية عبر قنوات كل منصة.</w:t>
             </w:r>
           </w:p>
         </w:tc>
@@ -7128,7 +7244,7 @@
                 <w:b w:val="0"/>
                 <w:sz w:val="20"/>
               </w:rPr>
-              <w:t>3) This power of attorney expressly excludes any banking or financial act: opening bank accounts, withdrawals and deposits, signing cheques, guarantees, loans and facilities. It also expressly excludes all judicial matters: courts, lawsuits, cases, enforcement, arbitration, settlement, the Public Prosecution and anything connected with them. [Optional items not included unless expressly added: transferring or selling share ownership, liquidating the Company, increasing or reducing its capital.]</w:t>
+              <w:t>3) This power of attorney expressly excludes: (a) all judicial matters: courts, lawsuits, cases, enforcement, arbitration, settlement, the Public Prosecution and anything connected with them, and any objection or grievance brought before a judicial or quasi-judicial body, adjudication committee or the Board of Grievances (an administrative objection or grievance before the same authority is included); (b) transferring, selling or pledging share ownership, liquidating or dissolving the Company, and increasing, reducing or changing its capital; and (c) opening bank accounts, deposits, withdrawals, transfers, signing cheques, guarantees, loans and facilities, and disposing of any funds, except as provided in the following clause.</w:t>
             </w:r>
           </w:p>
         </w:tc>
@@ -7159,7 +7275,7 @@
                 <w:sz w:val="22"/>
                 <w:rtl/>
               </w:rPr>
-              <w:t>‏3) يستثنى من هذه الوكالة صراحةً أي عمل بنكي أو مصرفي: فتح الحسابات والسحب والإيداع والتوقيع على الشيكات والكفالات والقروض والتسهيلات. وتستثنى كذلك صراحةً الأمور القضائية كلها: المحاكم والدعاوى والقضايا والتنفيذ والتحكيم والصلح والنيابة العامة وما يتصل بها. [بنود اختيارية لا تدخل ما لم تُضف صراحة: نقل ملكية الحصص أو بيعها، تصفية الشركة، زيادة رأس المال أو تخفيضه.]</w:t>
+              <w:t>‏3) يستثنى من هذه الوكالة صراحةً: (أ) الأمور القضائية كلها: المحاكم والدعاوى والقضايا والتنفيذ والتحكيم والصلح والنيابة العامة وما يتصل بها، وكل اعتراض أو تظلم يُرفع إلى جهة قضائية أو شبه قضائية أو لجنة فصل أو ديوان المظالم؛ أما الاعتراض والتظلم الإداري لدى الجهة نفسها فمشمول. (ب) نقل ملكية الحصص أو بيعها أو رهنها، وتصفية الشركة أو حلها، وزيادة رأس المال أو تخفيضه أو تغييره. (ج) فتح الحسابات البنكية والإيداع والسحب والتحويل والتوقيع على الشيكات والكفالات والقروض والتسهيلات والتصرف في أي أموال، وذلك فيما عدا ما نصّ عليه البند التالي.</w:t>
             </w:r>
           </w:p>
         </w:tc>
@@ -7186,7 +7302,7 @@
                 <w:b w:val="0"/>
                 <w:sz w:val="20"/>
               </w:rPr>
-              <w:t>4) This power of attorney includes everything necessary to carry out the matters stated even if not expressly mentioned, and the Agent may act on all of it without referring to the Principal, the Company's owner or its manager. It is limited to the Company named above and entities affiliated with it or established by the Principal in the Kingdom of Saudi Arabia, and does not extend to the Principal's assets or obligations in Egypt or outside the Kingdom.</w:t>
+              <w:t>4) Banking matters: the Agent may deal with banks to update the Company's records after any change in its name, trade name, constitutive contract, commercial register, managers or authorised signatories: submitting the updated documents, completing know-your-customer forms and updating the data and the names of authorised signatories, and receiving statements and letters, without disposing of any funds or accounts. Government fees are paid either by transferring them from the Company to the Agent to pay, or directly from the Company's account by its authorised account signatories; payment through official payment channels is not an excluded banking act.</w:t>
             </w:r>
           </w:p>
         </w:tc>
@@ -7217,7 +7333,7 @@
                 <w:sz w:val="22"/>
                 <w:rtl/>
               </w:rPr>
-              <w:t>‏4) تشمل هذه الوكالة كل ما يلزم لتنفيذ الأمور المذكورة وإن لم يُنص عليه، وللوكيل أن يتصرف في ذلك كله دون الرجوع إلى الموكِّلة أو مالك الشركة أو مديرها، وتقتصر على الشركة المذكورة وما يتبعها أو تؤسسه الموكِّلة في المملكة العربية السعودية، ولا تمتد إلى أصول الموكِّلة أو التزاماتها في مصر أو خارج المملكة.</w:t>
+              <w:t>‏4) الأمور البنكية: للوكيل مراجعة البنوك لتحديث بيانات الشركة لديها بعد أي تغيير في اسمها أو اسمها التجاري أو عقد تأسيسها أو سجلها التجاري أو مديريها أو المفوضين بالتوقيع عنها: تقديم المستندات المحدّثة، وتعبئة نماذج التعريف بالعميل وتحديث البيانات وأسماء المفوضين، واستلام الإفادات والخطابات، دون التصرف في الأموال أو الحسابات. وتُسدَّد الرسوم الحكومية إما بتحويلها من الشركة إلى الوكيل ليدفعها، وإما بدفعها مباشرة من حساب الشركة بمعرفة المفوضين على الحساب، ولا يُعد السداد بقنوات الدفع الرسمية عملاً بنكياً مستثنى.</w:t>
             </w:r>
           </w:p>
         </w:tc>
@@ -7244,7 +7360,7 @@
                 <w:b w:val="0"/>
                 <w:sz w:val="20"/>
               </w:rPr>
-              <w:t>5) Notice: this power of attorney remains valid and fully effective, and does not lapse, stop or require re-issue, upon any change of the Company's name, trade name, trademark or legal form, however often it occurs, because the Company is identified by its Unified National Number 7050483374 (700), not by its name. The Agent may carry out everything stated in it under the old name, the new name, or both, and may present this power of attorney to any authority together with the updated commercial register certificate or proof that the Unified National Number has not changed.</w:t>
+              <w:t>5) This power of attorney includes everything necessary to carry out the matters stated even if not expressly mentioned, and the Agent may act on all of it without referring to the Principal, the Company's owner or its manager. It is limited to the Company named above and entities affiliated with it or established by the Principal in the Kingdom of Saudi Arabia, and does not extend to the Principal's assets or obligations in Egypt or outside the Kingdom.</w:t>
             </w:r>
           </w:p>
         </w:tc>
@@ -7275,7 +7391,7 @@
                 <w:sz w:val="22"/>
                 <w:rtl/>
               </w:rPr>
-              <w:t>‏5) تنبيه: تبقى هذه الوكالة سارية ونافذة بكامل صلاحياتها ولا تسقط ولا تتوقف ولا تحتاج إلى إعادة إصدار عند تغيير اسم الشركة أو اسمها التجاري أو علامتها التجارية أو شكلها القانوني، مهما تكرر ذلك، لأن المعتبر في تحديد الشركة هو الرقم الوطني الموحد 7050483374 (700) وليس اسمها. وللوكيل أن يباشر كل ما ورد فيها باسم الشركة القديم أو الجديد أو بهما معاً، وأن يقدّم هذه الوكالة أمام أي جهة مع شهادة السجل التجاري المحدّثة أو ما يثبت أن الرقم الوطني الموحد لم يتغير.</w:t>
+              <w:t>‏5) تشمل هذه الوكالة كل ما يلزم لتنفيذ الأمور المذكورة وإن لم يُنص عليه، وللوكيل أن يتصرف في ذلك كله دون الرجوع إلى الموكِّلة أو مالك الشركة أو مديرها، وتقتصر على الشركة المذكورة وما يتبعها أو تؤسسه الموكِّلة في المملكة العربية السعودية، ولا تمتد إلى أصول الموكِّلة أو التزاماتها في مصر أو خارج المملكة.</w:t>
             </w:r>
           </w:p>
         </w:tc>
@@ -7302,7 +7418,7 @@
                 <w:b w:val="0"/>
                 <w:sz w:val="20"/>
               </w:rPr>
-              <w:t>6) Term of the power of attorney: [●] years from the date of attestation; it remains valid until the Principal cancels it by formal, notarised notice.</w:t>
+              <w:t>6) Notice: this power of attorney remains valid and fully effective, and does not lapse, stop or require re-issue, upon any change of the Company's name, trade name, trademark or legal form, however often it occurs, because the Company is identified by its Unified National Number 7050483374, not by its name; for identification only, the Company's current name is EIC Workspaces and its current commercial register number is [●]. The Agent may carry out everything stated in it under the old name, the new name, or both, and may present this power of attorney to any authority together with the updated commercial register certificate or proof that the Unified National Number has not changed.</w:t>
             </w:r>
           </w:p>
         </w:tc>
@@ -7333,7 +7449,7 @@
                 <w:sz w:val="22"/>
                 <w:rtl/>
               </w:rPr>
-              <w:t>‏6) مدة الوكالة: [●] سنة من تاريخ التصديق، وتبقى سارية حتى يُلغيها الموكِّل بإشعار رسمي موثّق.</w:t>
+              <w:t>‏6) تنبيه: تبقى هذه الوكالة سارية ونافذة بكامل صلاحياتها ولا تسقط ولا تتوقف ولا تحتاج إلى إعادة إصدار عند تغيير اسم الشركة أو اسمها التجاري أو علامتها التجارية أو شكلها القانوني، مهما تكرر ذلك، لأن المعتبر في تحديد الشركة هو الرقم الوطني الموحد 7050483374 وليس اسمها، ويُذكر هنا للتعريف: اسم الشركة الحالي «إي.آي.سي ووركسبايسز» ورقم سجلها التجاري الحالي [●]. وللوكيل أن يباشر كل ما ورد فيها باسم الشركة القديم أو الجديد أو بهما معاً، وأن يقدّم هذه الوكالة أمام أي جهة مع شهادة السجل التجاري المحدّثة أو ما يثبت أن الرقم الوطني الموحد لم يتغير.</w:t>
             </w:r>
           </w:p>
         </w:tc>
@@ -7360,7 +7476,7 @@
                 <w:b w:val="0"/>
                 <w:sz w:val="20"/>
               </w:rPr>
-              <w:t>7) This power of attorney is drawn up in Arabic and English; in case of discrepancy the Arabic text prevails.</w:t>
+              <w:t>7) Term of the power of attorney: two (2) years from the date of attestation, unless the Principal cancels it earlier by formal, notarised notice.</w:t>
             </w:r>
           </w:p>
         </w:tc>
@@ -7391,7 +7507,65 @@
                 <w:sz w:val="22"/>
                 <w:rtl/>
               </w:rPr>
-              <w:t>‏7) حُرّرت هذه الوكالة بلغتين، العربية والإنجليزية، وعند الاختلاف يُعتدّ بالنص العربي.</w:t>
+              <w:t>‏7) مدة الوكالة: سنتان (2) من تاريخ التصديق، ما لم يُلغها الموكِّل قبل ذلك بإشعار رسمي موثّق.</w:t>
+            </w:r>
+          </w:p>
+        </w:tc>
+      </w:tr>
+      <w:tr>
+        <w:tc>
+          <w:tcPr>
+            <w:tcW w:type="dxa" w:w="4932"/>
+            <w:tcBorders>
+              <w:top w:val="nil"/>
+              <w:left w:val="nil"/>
+              <w:right w:val="nil"/>
+              <w:bottom w:val="single" w:sz="4" w:color="C9D1DA"/>
+            </w:tcBorders>
+          </w:tcPr>
+          <w:p>
+            <w:pPr>
+              <w:spacing w:after="60" w:line="276" w:lineRule="auto"/>
+              <w:jc w:val="left"/>
+            </w:pPr>
+            <w:r/>
+            <w:r>
+              <w:rPr>
+                <w:b w:val="0"/>
+                <w:sz w:val="20"/>
+              </w:rPr>
+              <w:t>8) This power of attorney is drawn up in Arabic and English; in case of discrepancy the Arabic text prevails.</w:t>
+            </w:r>
+          </w:p>
+        </w:tc>
+        <w:tc>
+          <w:tcPr>
+            <w:tcW w:type="dxa" w:w="4932"/>
+            <w:tcBorders>
+              <w:top w:val="nil"/>
+              <w:left w:val="nil"/>
+              <w:right w:val="nil"/>
+              <w:bottom w:val="single" w:sz="4" w:color="C9D1DA"/>
+            </w:tcBorders>
+          </w:tcPr>
+          <w:p>
+            <w:pPr>
+              <w:bidi/>
+              <w:spacing w:after="60" w:line="276" w:lineRule="auto"/>
+              <w:jc w:val="right"/>
+            </w:pPr>
+            <w:r>
+              <w:rPr>
+                <w:rtl/>
+              </w:rPr>
+            </w:r>
+            <w:r>
+              <w:rPr>
+                <w:b w:val="0"/>
+                <w:sz w:val="22"/>
+                <w:rtl/>
+              </w:rPr>
+              <w:t>‏8) حُرّرت هذه الوكالة بلغتين، العربية والإنجليزية، وعند الاختلاف يُعتدّ بالنص العربي.</w:t>
             </w:r>
           </w:p>
         </w:tc>

</xml_diff>